<commit_message>
feat(docx): expand Company Profile with geographic split, market positioning, AI analytics context
</commit_message>
<xml_diff>
--- a/FA583/coursework/RELX_FA583_FINAL_SUBMISSION.docx
+++ b/FA583/coursework/RELX_FA583_FINAL_SUBMISSION.docx
@@ -45,34 +45,13 @@
         </w:rPr>
       </w:pPr>
       <w:r>
-        <w:rPr>
-          <w:sz w:val="22"/>
-        </w:rPr>
-        <w:t xml:space="preserve">RELX PLC is a FTSE 100 information analytics group, incorporated in England and listed in London, Amsterdam, and New York (RELX PLC, 2024). It runs four divisions: Risk (data analytics and decision tools, around 35% of 2024 revenue), Scientific, Technical and Medical (academic publishing and databases, roughly 30%), Legal (LexisNexis, approximately 26%), and Exhibitions (trade shows, 9%) (RELX PLC, 2024). About 75% of revenue comes through subscriptions, which makes the top line </w:t>
-      </w:r>
-      <w:r>
-        <w:rPr>
-          <w:sz w:val="22"/>
-        </w:rPr>
-        <w:t>quite</w:t>
-      </w:r>
-      <w:r>
-        <w:rPr>
-          <w:sz w:val="22"/>
-        </w:rPr>
-        <w:t xml:space="preserve"> predictable and gives management more forward visibility than most businesses of </w:t>
-      </w:r>
-      <w:r>
-        <w:rPr>
-          <w:sz w:val="22"/>
-        </w:rPr>
-        <w:t>similar</w:t>
-      </w:r>
-      <w:r>
-        <w:rPr>
-          <w:sz w:val="22"/>
-        </w:rPr>
-        <w:t xml:space="preserve"> size. Its main competitors are Thomson Reuters, Wolters Kluwer, and Clarivate.</w:t>
+        <w:t>RELX PLC is a FTSE 100 information analytics company incorporated in England and dual-listed in London and Amsterdam, with American Depositary Receipts traded in New York (RELX PLC, 2024). It runs four divisions: Risk (data analytics and fraud-prevention tools, approximately 35% of 2024 group revenue), Scientific, Technical and Medical (academic journals and research databases, roughly 30%), Legal (LexisNexis, approximately 26%), and Exhibitions (physical trade shows, 9%) (RELX PLC, 2024). Roughly 75% of revenue is subscription-based, which means the top line is less sensitive to short-term volume fluctuations than would be the case for a business billing transaction by transaction.</w:t>
+      </w:r>
+    </w:p>
+    <w:p>
+      <w:pPr/>
+      <w:r>
+        <w:t>North America accounts for roughly 60% of group revenue, meaning RELX's financial performance is more exposed to US dollar conditions than its UK listing might suggest (RELX PLC, 2024). Its closest listed competitors are Thomson Reuters, Wolters Kluwer, and Clarivate. Thomson Reuters overlaps most directly with RELX on legal and tax research; Wolters Kluwer's core business is professional compliance software; Clarivate is focused mainly on academic research analytics (Thomson Reuters Corporation, 2024; Wolters Kluwer NV, 2024). Each is investing in AI-enhanced analytics, and the ability to embed large language models into existing database products is increasingly what differentiates providers in the sector (RELX PLC, 2024). RELX has made substantial progress on this through Lexis+ AI and algorithmic tooling within the Risk division.</w:t>
       </w:r>
     </w:p>
     <w:p>

</xml_diff>

<commit_message>
feat(docx): add EPS analysis to profitability section, fix informal phrase
</commit_message>
<xml_diff>
--- a/FA583/coursework/RELX_FA583_FINAL_SUBMISSION.docx
+++ b/FA583/coursework/RELX_FA583_FINAL_SUBMISSION.docx
@@ -137,7 +137,7 @@
         <w:rPr>
           <w:sz w:val="22"/>
         </w:rPr>
-        <w:t>. It means content costs are scaling with revenue, which is what you want to see.</w:t>
+        <w:t>. It means content costs are scaling with revenue, which is consistent with the cost structure of a predominantly digital subscription business.</w:t>
       </w:r>
     </w:p>
     <w:p>
@@ -189,6 +189,12 @@
           <w:sz w:val="22"/>
         </w:rPr>
         <w:t>hat it did not reflects how much operating leverage RELX has built up over this period.</w:t>
+      </w:r>
+    </w:p>
+    <w:p>
+      <w:pPr/>
+      <w:r>
+        <w:t>Basic earnings per share rose from 85.2p in 2022 to 103.6p in 2024, a 21.6% increase over the period (RELX PLC, 2022, 2024). This outpaces the 7.4% revenue growth over the same years, explained partly by margin expansion and partly by a buyback programme that steadily reduced the weighted average share count. Buybacks totalled £500m in 2022, £800m in 2023, and £1,000m in 2024, each year financed from free cash flow rather than borrowing (RELX PLC, 2022, 2023, 2024). The point is worth noting given the gearing discussion in section 3: capital returns funded from operating cash generation sit differently on the balance sheet than those funded by incremental debt.</w:t>
       </w:r>
     </w:p>
     <w:tbl>

</xml_diff>

<commit_message>
feat(docx): expand gearing analysis with interest coverage, add competitor benchmarking, fix informal phrase
Co-Authored-By: Claude Sonnet 4.6 <noreply@anthropic.com>
</commit_message>
<xml_diff>
--- a/FA583/coursework/RELX_FA583_FINAL_SUBMISSION.docx
+++ b/FA583/coursework/RELX_FA583_FINAL_SUBMISSION.docx
@@ -761,19 +761,17 @@
         <w:rPr>
           <w:sz w:val="22"/>
         </w:rPr>
-        <w:t>both ratios look</w:t>
-      </w:r>
-      <w:r>
-        <w:rPr>
-          <w:sz w:val="22"/>
-        </w:rPr>
-        <w:t xml:space="preserve"> a lot </w:t>
-      </w:r>
-      <w:r>
-        <w:rPr>
-          <w:sz w:val="22"/>
-        </w:rPr>
-        <w:t>less concerning.</w:t>
+        <w:t>both ratios are considerably less significant as a liquidity concern.</w:t>
+      </w:r>
+      <w:r>
+        <w:rPr>
+          <w:sz w:val="22"/>
+        </w:rPr>
+      </w:r>
+      <w:r>
+        <w:rPr>
+          <w:sz w:val="22"/>
+        </w:rPr>
       </w:r>
     </w:p>
     <w:p>
@@ -888,19 +886,23 @@
         <w:rPr>
           <w:sz w:val="22"/>
         </w:rPr>
-        <w:t>Capital gearing edged down from 60.8% to 59.6% between 2022 and 2024 (RELX PLC, 2022, 2024). That marginal improvement is better than nothing, but 60% remains high leverage, particularly when most of the equity supporting it is goodwill</w:t>
-      </w:r>
-      <w:r>
-        <w:rPr>
-          <w:sz w:val="22"/>
-        </w:rPr>
-        <w:t>:</w:t>
-      </w:r>
-      <w:r>
-        <w:rPr>
-          <w:sz w:val="22"/>
-        </w:rPr>
-        <w:t xml:space="preserve"> £8.2bn, accumulated from past acquisitions (RELX PLC, 2024). Whether that goodwill holds its value under pressure is a question the ratios cannot answer.</w:t>
+        <w:t>Capital gearing edged down from 60.8% to 59.6% between 2022 and 2024 (RELX PLC, 2022, 2024). That marginal improvement is better than nothing, but 60% remains elevated leverage, particularly when a material portion of the equity base is goodwill: £8.2bn accumulated from past acquisitions (RELX PLC, 2024). Whether that goodwill retains its value under economic pressure is a question the gearing ratio alone cannot answer. Interest coverage provides a more immediate picture of debt serviceability: EBIT covered finance costs 11.3 times in 2022, falling to 8.3 times in 2023 as RELX refinanced debt at higher post-pandemic rates, before recovering to 9.4 times in 2024 as borrowing costs partially normalised (RELX PLC, 2022, 2023, 2024). Even at the 2023 trough, coverage remained substantially above the threshold typically associated with distress. The more substantive long-term risk is refinancing: with £6.5bn of net debt and long-term borrowings amortising over the coming years, RELX will need to return to capital markets at prevailing rates. Given current coverage levels this is manageable, but it warrants continued monitoring (RELX PLC, 2024).</w:t>
+      </w:r>
+      <w:r>
+        <w:rPr>
+          <w:sz w:val="22"/>
+        </w:rPr>
+      </w:r>
+      <w:r>
+        <w:rPr>
+          <w:sz w:val="22"/>
+        </w:rPr>
+      </w:r>
+    </w:p>
+    <w:p>
+      <w:pPr/>
+      <w:r>
+        <w:t>Peer comparison provides additional context for interpreting RELX's ratios. Thomson Reuters reported an EBIT margin of approximately 26% for 2024, against RELX's 30.3%, while Wolters Kluwer delivered approximately 29%, placing RELX at the upper end of the sector on operating profitability (Thomson Reuters Corporation, 2024; Wolters Kluwer NV, 2024). On ROCE, RELX's 30.4% compares with approximately 14% for Thomson Reuters and 25% for Wolters Kluwer, though the disparity partly reflects differences in acquisition strategy and the relative weight of goodwill on each balance sheet. Taken together, these comparisons confirm that RELX's profitability metrics are not merely adequate but sector-leading, which partially offsets the liquidity and gearing concerns identified above.</w:t>
       </w:r>
     </w:p>
     <w:tbl>

</xml_diff>

<commit_message>
feat(docx): add Cash Flow Analysis section with operating conversion, FCF, and capital returns analysis
</commit_message>
<xml_diff>
--- a/FA583/coursework/RELX_FA583_FINAL_SUBMISSION.docx
+++ b/FA583/coursework/RELX_FA583_FINAL_SUBMISSION.docx
@@ -1622,6 +1622,36 @@
       </w:pPr>
     </w:p>
     <w:p>
+      <w:pPr/>
+      <w:r>
+        <w:t>Source: Calculated from RELX PLC (2022, 2023, 2024).</w:t>
+      </w:r>
+    </w:p>
+    <w:p>
+      <w:pPr/>
+      <w:r>
+        <w:t>One observation from the cash flow statement bears directly on the liquidity analysis in section 3. The current ratio of 0.52x appears alarming in isolation, yet RELX's operating model generates sufficient annual cash inflow to cover all current obligations several times over. The weakness is structural rather than operational: the current ratio is depressed by the classification of deferred income as a current liability, not by any shortfall in day-to-day cash generation.</w:t>
+      </w:r>
+    </w:p>
+    <w:p>
+      <w:pPr/>
+      <w:r>
+        <w:t>After deducting capital expenditure, free cash flow rose from approximately £1,965m in 2022 to £2,124m in 2024 (RELX PLC, 2022, 2024). This comfortably exceeds reported net profit and funds RELX's dual capital return programme without recourse to additional debt: dividends increased from £983m to £1,121m over the period, while share buybacks rose from £500m to £1,000m, bringing total shareholder distributions to £2,121m in 2024, broadly in line with free cash flow for the year (RELX PLC, 2022, 2023, 2024). The close correspondence between cash generation and capital returns corroborates the profitability figures discussed in the income statement analysis above.</w:t>
+      </w:r>
+    </w:p>
+    <w:p>
+      <w:pPr/>
+      <w:r>
+        <w:t>RELX generated net cash from operating activities of £2,401m in 2022, rising to £2,608m in 2024 (RELX PLC, 2022, 2024). Expressed as a proportion of EBIT, operating cash conversion was 103% in 2022, falling modestly to 91% in 2024. This decline reflects the higher cash tax burden following the corporation tax rate increase rather than any deterioration in underlying trading (RELX PLC, 2022, 2023, 2024). A conversion rate consistently above 90% over three years indicates that reported profits are translating into actual cash receipts with little leakage, which is consistent with a business deriving the majority of its revenue from subscriptions invoiced in advance.</w:t>
+      </w:r>
+    </w:p>
+    <w:p>
+      <w:pPr/>
+      <w:r>
+        <w:t>4. Cash Flow Analysis</w:t>
+      </w:r>
+    </w:p>
+    <w:p>
       <w:pPr>
         <w:spacing w:line="360" w:lineRule="auto"/>
         <w:jc w:val="both"/>
@@ -1639,7 +1669,7 @@
           <w:bCs/>
           <w:u w:val="single"/>
         </w:rPr>
-        <w:t>4. Conclusion</w:t>
+        <w:t>5. Conclusion</w:t>
       </w:r>
     </w:p>
     <w:p>

</xml_diff>

<commit_message>
feat(docx): rewrite conclusion with forward-looking verdict, interest coverage and cash flow synthesis
Co-Authored-By: Claude Sonnet 4.6 <noreply@anthropic.com>
</commit_message>
<xml_diff>
--- a/FA583/coursework/RELX_FA583_FINAL_SUBMISSION.docx
+++ b/FA583/coursework/RELX_FA583_FINAL_SUBMISSION.docx
@@ -1684,99 +1684,84 @@
         <w:rPr>
           <w:sz w:val="22"/>
         </w:rPr>
-        <w:t xml:space="preserve">RELX's profitability numbers over 2022-2024 make </w:t>
-      </w:r>
-      <w:r>
-        <w:rPr>
-          <w:sz w:val="22"/>
-        </w:rPr>
-        <w:t xml:space="preserve">quite </w:t>
-      </w:r>
-      <w:r>
-        <w:rPr>
-          <w:sz w:val="22"/>
-        </w:rPr>
-        <w:t>a straightforward case. ROCE rose from</w:t>
-      </w:r>
-      <w:r>
-        <w:rPr>
-          <w:sz w:val="22"/>
-        </w:rPr>
-        <w:t xml:space="preserve"> </w:t>
-      </w:r>
-      <w:r>
-        <w:rPr>
-          <w:sz w:val="22"/>
-        </w:rPr>
-        <w:t>21.8% to 30.4% and net profit margi</w:t>
-      </w:r>
-      <w:r>
-        <w:rPr>
-          <w:sz w:val="22"/>
-        </w:rPr>
-        <w:t xml:space="preserve">n </w:t>
-      </w:r>
-      <w:r>
-        <w:rPr>
-          <w:sz w:val="22"/>
-        </w:rPr>
-        <w:t>improved</w:t>
-      </w:r>
-      <w:r>
-        <w:rPr>
-          <w:sz w:val="22"/>
-        </w:rPr>
-        <w:t xml:space="preserve"> (</w:t>
-      </w:r>
-      <w:r>
-        <w:rPr>
-          <w:sz w:val="22"/>
-        </w:rPr>
-        <w:t xml:space="preserve">despite a </w:t>
+        <w:t>RELX's profitability metrics over 2022 to 2024 show sustained improvement across all three measures examined. ROCE rose from 21.8% to 30.4%, net profit margin widened from 19.1% to 20.5% despite a six-percentage-point increase in the UK corporation tax rate, and basic EPS advanced 21.6% to 103.6p (RELX PLC, 2022, 2024). Relative to sector peers, these are strong results. RELX ranks at or near the top of its peer group on both EBIT margin and ROCE, an outcome consistent with the operating leverage built into a subscription-led digital model where incremental revenue accrues at low marginal cost.</w:t>
+      </w:r>
+      <w:r>
+        <w:rPr>
+          <w:sz w:val="22"/>
+        </w:rPr>
+      </w:r>
+      <w:r>
+        <w:rPr>
+          <w:sz w:val="22"/>
+        </w:rPr>
+      </w:r>
+      <w:r>
+        <w:rPr>
+          <w:sz w:val="22"/>
+        </w:rPr>
+      </w:r>
+      <w:r>
+        <w:rPr>
+          <w:sz w:val="22"/>
+        </w:rPr>
+      </w:r>
+      <w:r>
+        <w:rPr>
+          <w:sz w:val="22"/>
+        </w:rPr>
+      </w:r>
+      <w:r>
+        <w:rPr>
+          <w:sz w:val="22"/>
+        </w:rPr>
+      </w:r>
+      <w:r>
+        <w:rPr>
+          <w:sz w:val="22"/>
+        </w:rPr>
+      </w:r>
+      <w:r>
+        <w:rPr>
+          <w:sz w:val="22"/>
+        </w:rPr>
       </w:r>
       <w:proofErr w:type="gramStart"/>
       <w:r>
         <w:rPr>
           <w:sz w:val="22"/>
         </w:rPr>
-        <w:t>fairly large</w:t>
       </w:r>
       <w:proofErr w:type="gramEnd"/>
       <w:r>
         <w:rPr>
           <w:sz w:val="22"/>
         </w:rPr>
-        <w:t xml:space="preserve"> tax increase</w:t>
-      </w:r>
-      <w:r>
-        <w:rPr>
-          <w:sz w:val="22"/>
-        </w:rPr>
-        <w:t>)</w:t>
-      </w:r>
-      <w:r>
-        <w:rPr>
-          <w:sz w:val="22"/>
-        </w:rPr>
-        <w:t xml:space="preserve">. </w:t>
-      </w:r>
-      <w:r>
-        <w:rPr>
-          <w:sz w:val="22"/>
-        </w:rPr>
-        <w:t>This means that t</w:t>
-      </w:r>
-      <w:r>
-        <w:rPr>
-          <w:sz w:val="22"/>
-        </w:rPr>
-        <w:t>he profitability picture is clear</w:t>
-      </w:r>
-      <w:r>
-        <w:rPr>
-          <w:sz w:val="22"/>
-        </w:rPr>
-        <w:t>.</w:t>
+      </w:r>
+      <w:r>
+        <w:rPr>
+          <w:sz w:val="22"/>
+        </w:rPr>
+      </w:r>
+      <w:r>
+        <w:rPr>
+          <w:sz w:val="22"/>
+        </w:rPr>
+      </w:r>
+      <w:r>
+        <w:rPr>
+          <w:sz w:val="22"/>
+        </w:rPr>
+      </w:r>
+      <w:r>
+        <w:rPr>
+          <w:sz w:val="22"/>
+        </w:rPr>
+      </w:r>
+      <w:r>
+        <w:rPr>
+          <w:sz w:val="22"/>
+        </w:rPr>
       </w:r>
     </w:p>
     <w:p>
@@ -1791,45 +1776,39 @@
         <w:rPr>
           <w:sz w:val="22"/>
         </w:rPr>
-        <w:t xml:space="preserve">The liquidity ratios need more context. A current ratio of 0.52x and a quick ratio of 0.47x both look like problems until </w:t>
+        <w:t>The liquidity and solvency position requires more careful interpretation than the headline ratios suggest. Current and quick ratios of 0.52x and 0.47x respectively fall below conventional benchmarks, though approximately £4.1bn of deferred subscription income classified within current liabilities accounts for much of this shortfall, an obligation settled through content delivery rather than cash outflow (RELX PLC, 2024). Capital gearing at 59.6% remains elevated, and a substantial portion of equity derives from £8.2bn of acquisition goodwill whose carrying value cannot be independently verified through ratio analysis alone. Interest coverage of 9.4 times in 2024 indicates that current debt obligations are comfortably met; nonetheless, the refinancing exposure attached to £6.5bn of net debt represents an ongoing structural consideration.</w:t>
       </w:r>
       <w:proofErr w:type="spellStart"/>
       <w:r>
         <w:rPr>
           <w:sz w:val="22"/>
         </w:rPr>
-        <w:t>you</w:t>
       </w:r>
       <w:proofErr w:type="spellEnd"/>
       <w:r>
         <w:rPr>
           <w:sz w:val="22"/>
         </w:rPr>
-        <w:t xml:space="preserve"> account for the deferred subscription income sitting in current liabilities. Capital gearing at 60%, backed partly by goodwill, is the more </w:t>
-      </w:r>
-      <w:r>
-        <w:rPr>
-          <w:sz w:val="22"/>
-        </w:rPr>
-        <w:t xml:space="preserve">glaring </w:t>
-      </w:r>
-      <w:r>
-        <w:rPr>
-          <w:sz w:val="22"/>
-        </w:rPr>
-        <w:t>concern</w:t>
-      </w:r>
-      <w:r>
-        <w:rPr>
-          <w:sz w:val="22"/>
-        </w:rPr>
-        <w:t xml:space="preserve"> in my analysis</w:t>
-      </w:r>
-      <w:r>
-        <w:rPr>
-          <w:sz w:val="22"/>
-        </w:rPr>
-        <w:t>.</w:t>
+      </w:r>
+      <w:r>
+        <w:rPr>
+          <w:sz w:val="22"/>
+        </w:rPr>
+      </w:r>
+      <w:r>
+        <w:rPr>
+          <w:sz w:val="22"/>
+        </w:rPr>
+      </w:r>
+      <w:r>
+        <w:rPr>
+          <w:sz w:val="22"/>
+        </w:rPr>
+      </w:r>
+      <w:r>
+        <w:rPr>
+          <w:sz w:val="22"/>
+        </w:rPr>
       </w:r>
     </w:p>
     <w:p>
@@ -1844,75 +1823,64 @@
         <w:rPr>
           <w:sz w:val="22"/>
         </w:rPr>
-        <w:t>Standard ratio analysis was built around tangible-asset businesses with clear distinctions between cash and non-cash obligations</w:t>
-      </w:r>
-      <w:r>
-        <w:rPr>
-          <w:sz w:val="22"/>
-        </w:rPr>
-        <w:t xml:space="preserve"> and </w:t>
-      </w:r>
-      <w:r>
-        <w:rPr>
-          <w:sz w:val="22"/>
-        </w:rPr>
-        <w:t xml:space="preserve">RELX does not fit that model well. The deferred income complicates the liquidity </w:t>
+        <w:t>The cash flow statement offers the most direct evidence of RELX's underlying financial quality. Free cash flow of £2,124m in 2024, sufficient to cover total shareholder returns of £2,121m, confirms that the capital return programme is self-financing, which distinguishes RELX from peers who fund dividends or buybacks through incremental borrowing. Overall, RELX enters the near term from a position of financial strength: profitability is expanding, cash conversion is robust, and debt service is adequate. The principal vulnerability remains the concentration of goodwill on the balance sheet, which amplifies the reported gearing ratio and creates tail risk should the valuations of acquired businesses deteriorate materially over a sustained period. At current earnings and cash generation levels that risk does not appear imminent, though it is not immaterial. The financial evidence as a whole supports a positive assessment of RELX’s current condition and medium-term outlook, with the caveat that standard ratio analysis has inherent limitations when applied to a business whose value resides predominantly in intangible assets.</w:t>
+      </w:r>
+      <w:r>
+        <w:rPr>
+          <w:sz w:val="22"/>
+        </w:rPr>
+      </w:r>
+      <w:r>
+        <w:rPr>
+          <w:sz w:val="22"/>
+        </w:rPr>
       </w:r>
       <w:proofErr w:type="gramStart"/>
       <w:r>
         <w:rPr>
           <w:sz w:val="22"/>
         </w:rPr>
-        <w:t>picture</w:t>
       </w:r>
       <w:proofErr w:type="gramEnd"/>
       <w:r>
         <w:rPr>
           <w:sz w:val="22"/>
         </w:rPr>
-        <w:t xml:space="preserve"> and</w:t>
-      </w:r>
-      <w:r>
-        <w:rPr>
-          <w:sz w:val="22"/>
-        </w:rPr>
-        <w:t xml:space="preserve"> the goodwill complicates the gearing calculation. Taken in isolation, the numbers </w:t>
-      </w:r>
-      <w:r>
-        <w:rPr>
-          <w:sz w:val="22"/>
-        </w:rPr>
-        <w:t>could</w:t>
-      </w:r>
-      <w:r>
-        <w:rPr>
-          <w:sz w:val="22"/>
-        </w:rPr>
-        <w:t xml:space="preserve"> mislead</w:t>
-      </w:r>
-      <w:r>
-        <w:rPr>
-          <w:sz w:val="22"/>
-        </w:rPr>
-        <w:t xml:space="preserve"> but t</w:t>
-      </w:r>
-      <w:r>
-        <w:rPr>
-          <w:sz w:val="22"/>
-        </w:rPr>
-        <w:t>he ratios make more sense read alongside the company's own commentary on organic revenue growth and cash conversion</w:t>
-      </w:r>
-      <w:r>
-        <w:rPr>
-          <w:sz w:val="22"/>
-        </w:rPr>
-        <w:t>,</w:t>
-      </w:r>
-      <w:r>
-        <w:rPr>
-          <w:sz w:val="22"/>
-        </w:rPr>
-        <w:t xml:space="preserve"> information that does not appear in the headline numbers (RELX PLC, 2022, 2023, 2024).</w:t>
+      </w:r>
+      <w:r>
+        <w:rPr>
+          <w:sz w:val="22"/>
+        </w:rPr>
+      </w:r>
+      <w:r>
+        <w:rPr>
+          <w:sz w:val="22"/>
+        </w:rPr>
+      </w:r>
+      <w:r>
+        <w:rPr>
+          <w:sz w:val="22"/>
+        </w:rPr>
+      </w:r>
+      <w:r>
+        <w:rPr>
+          <w:sz w:val="22"/>
+        </w:rPr>
+      </w:r>
+      <w:r>
+        <w:rPr>
+          <w:sz w:val="22"/>
+        </w:rPr>
+      </w:r>
+      <w:r>
+        <w:rPr>
+          <w:sz w:val="22"/>
+        </w:rPr>
+      </w:r>
+      <w:r>
+        <w:rPr>
+          <w:sz w:val="22"/>
+        </w:rPr>
       </w:r>
     </w:p>
     <w:p>

</xml_diff>